<commit_message>
Se agrego el link del repositorio de github
</commit_message>
<xml_diff>
--- a/Investigacion.docx
+++ b/Investigacion.docx
@@ -5,10 +5,7 @@
     <w:p>
       <w:proofErr w:type="gramStart"/>
       <w:r>
-        <w:t>Que</w:t>
-      </w:r>
-      <w:r>
-        <w:t xml:space="preserve"> es Git?</w:t>
+        <w:t>Que es Git?</w:t>
       </w:r>
       <w:proofErr w:type="gramEnd"/>
     </w:p>
@@ -20,10 +17,7 @@
     <w:p>
       <w:proofErr w:type="gramStart"/>
       <w:r>
-        <w:t>Que</w:t>
-      </w:r>
-      <w:r>
-        <w:t xml:space="preserve"> es GitHub?</w:t>
+        <w:t>Que es GitHub?</w:t>
       </w:r>
       <w:proofErr w:type="gramEnd"/>
     </w:p>
@@ -35,13 +29,7 @@
     <w:p>
       <w:proofErr w:type="gramStart"/>
       <w:r>
-        <w:t>Que</w:t>
-      </w:r>
-      <w:r>
-        <w:t xml:space="preserve"> es una Branch</w:t>
-      </w:r>
-      <w:r>
-        <w:t>?</w:t>
+        <w:t>Que es una Branch?</w:t>
       </w:r>
       <w:proofErr w:type="gramEnd"/>
     </w:p>
@@ -51,12 +39,8 @@
       </w:r>
     </w:p>
     <w:p>
-      <w:proofErr w:type="gramStart"/>
-      <w:r>
-        <w:t>Que</w:t>
-      </w:r>
-      <w:r>
-        <w:t xml:space="preserve"> es un </w:t>
+      <w:r>
+        <w:t xml:space="preserve">Que es un </w:t>
       </w:r>
       <w:proofErr w:type="spellStart"/>
       <w:r>
@@ -66,7 +50,6 @@
       <w:r>
         <w:t>?</w:t>
       </w:r>
-      <w:proofErr w:type="gramEnd"/>
     </w:p>
     <w:p>
       <w:r>
@@ -90,12 +73,8 @@
       </w:r>
     </w:p>
     <w:p>
-      <w:proofErr w:type="gramStart"/>
-      <w:r>
-        <w:t>Que</w:t>
-      </w:r>
-      <w:r>
-        <w:t xml:space="preserve"> es un Pull </w:t>
+      <w:r>
+        <w:t xml:space="preserve">Que es un Pull </w:t>
       </w:r>
       <w:proofErr w:type="spellStart"/>
       <w:r>
@@ -105,7 +84,6 @@
       <w:r>
         <w:t>?</w:t>
       </w:r>
-      <w:proofErr w:type="gramEnd"/>
     </w:p>
     <w:p>
       <w:r>
@@ -121,12 +99,8 @@
       </w:r>
     </w:p>
     <w:p>
-      <w:proofErr w:type="gramStart"/>
-      <w:r>
-        <w:t>Que</w:t>
-      </w:r>
-      <w:r>
-        <w:t xml:space="preserve"> es un </w:t>
+      <w:r>
+        <w:t xml:space="preserve">Que es un </w:t>
       </w:r>
       <w:proofErr w:type="spellStart"/>
       <w:r>
@@ -136,7 +110,6 @@
       <w:r>
         <w:t>?</w:t>
       </w:r>
-      <w:proofErr w:type="gramEnd"/>
     </w:p>
     <w:p>
       <w:r>
@@ -165,6 +138,15 @@
       <w:proofErr w:type="spellEnd"/>
       <w:r>
         <w:t>), unificando el trabajo en una sola línea de desarrollo.</w:t>
+      </w:r>
+    </w:p>
+    <w:p>
+      <w:r>
+        <w:lastRenderedPageBreak/>
+        <w:br/>
+      </w:r>
+      <w:r>
+        <w:t>https://github.com/DanielsSO/Git-y-Github.git</w:t>
       </w:r>
     </w:p>
     <w:sectPr>
@@ -780,6 +762,7 @@
   <w:style w:type="character" w:default="1" w:styleId="Fuentedeprrafopredeter">
     <w:name w:val="Default Paragraph Font"/>
     <w:uiPriority w:val="1"/>
+    <w:semiHidden/>
     <w:unhideWhenUsed/>
   </w:style>
   <w:style w:type="table" w:default="1" w:styleId="Tablanormal">

</xml_diff>